<commit_message>
Amend the Word TAD for Vercel + Neon hosting
Same Amendment 1 as docs/TAD.md: hosting, scheduling, file storage,
deployment and risk rows updated and marked.

Co-Authored-By: Claude Opus 5.5 <noreply@anthropic.com>
</commit_message>
<xml_diff>
--- a/docs/KISS_VTMP_TAD_v1.0.docx
+++ b/docs/KISS_VTMP_TAD_v1.0.docx
@@ -180,6 +180,11 @@
     <w:p>
       <w:r>
         <w:t>Where this TAD and v2.1 differ, this TAD wins for architecture; the BRD wins for business rules.</w:t>
+      </w:r>
+    </w:p>
+    <w:p>
+      <w:r>
+        <w:t>Amendment 1 (2026-10-19): hosting is Vercel + Neon only. The API no longer runs on Render/Railway: Render requires a card, and the team’s card was declined. One Vercel project (Hobby, function region sin1) serves the React SPA and runs the unchanged Express app as a serverless function on the same origin. PostgreSQL 16 is on Neon (Singapore). Locally and in CI the API still runs as a normal server. Effects: scheduling (ADR-07, §8.2) uses Vercel Cron in production with node-cron only locally; security rate limits share counts in a Postgres table because serverless instances share no memory; files go to an object store because functions have no persistent disk; the free-tier risks in §15.1 change accordingly. Rows changed by this amendment are marked “(Amendment 1)”. Setup and reasons: docs/DEPLOYMENT.md and docs/PROGRESS.md (Sprint 2).</w:t>
       </w:r>
     </w:p>
     <w:p>
@@ -679,7 +684,7 @@
           </w:tcPr>
           <w:p>
             <w:r>
-              <w:t>In-process scheduler (node-cron) for risk flags</w:t>
+              <w:t>Scheduled job for risk flags: Vercel Cron in production, node-cron locally (Amendment 1)</w:t>
             </w:r>
           </w:p>
         </w:tc>
@@ -1200,7 +1205,7 @@
           </w:tcPr>
           <w:p>
             <w:r>
-              <w:t>node-cron</w:t>
+              <w:t>Vercel Cron (production), node-cron (local) (Amendment 1)</w:t>
             </w:r>
           </w:p>
         </w:tc>
@@ -1232,7 +1237,7 @@
           </w:tcPr>
           <w:p>
             <w:r>
-              <w:t>S3-compatible bucket (e.g. Cloudflare R2 / Supabase Storage)</w:t>
+              <w:t>Private object store reachable from Vercel without a card (Vercel Blob or Neon object storage; chosen in Sprint 6) (Amendment 1)</w:t>
             </w:r>
           </w:p>
         </w:tc>
@@ -1361,17 +1366,17 @@
           </w:tcPr>
           <w:p>
             <w:r>
-              <w:t>Vercel / Netlify (frontend), Render / Railway (API), Neon / Supabase (PostgreSQL)</w:t>
-            </w:r>
-          </w:p>
-        </w:tc>
-        <w:tc>
-          <w:tcPr>
-            <w:tcW w:w="3120" w:type="dxa"/>
-          </w:tcPr>
-          <w:p>
-            <w:r>
-              <w:t>Free-tier deployment</w:t>
+              <w:t>Vercel (frontend + API as a serverless function, region sin1), Neon (PostgreSQL 16, Singapore) (Amendment 1)</w:t>
+            </w:r>
+          </w:p>
+        </w:tc>
+        <w:tc>
+          <w:tcPr>
+            <w:tcW w:w="3120" w:type="dxa"/>
+          </w:tcPr>
+          <w:p>
+            <w:r>
+              <w:t>Free-tier deployment, no card required</w:t>
             </w:r>
           </w:p>
         </w:tc>
@@ -1532,8 +1537,6 @@
           <w:p>
             <w:r>
               <w:t xml:space="preserve">Login, refresh, logout, password change, RBAC + ownership </w:t>
-            </w:r>
-            <w:r>
               <w:lastRenderedPageBreak/>
               <w:t>middleware</w:t>
             </w:r>
@@ -3113,8 +3116,6 @@
           <w:p>
             <w:r>
               <w:t xml:space="preserve">flag_id (PK), </w:t>
-            </w:r>
-            <w:r>
               <w:lastRenderedPageBreak/>
               <w:t>student_id, batch_id, level, reasons (JSONB), opened_at, closed_at, escalated_at</w:t>
             </w:r>
@@ -3128,8 +3129,6 @@
             <w:r>
               <w:lastRenderedPageBreak/>
               <w:t xml:space="preserve">one open flag per </w:t>
-            </w:r>
-            <w:r>
               <w:lastRenderedPageBreak/>
               <w:t>(student, batch) via partial unique index</w:t>
             </w:r>
@@ -4428,7 +4427,7 @@
         </w:numPr>
       </w:pPr>
       <w:r>
-        <w:t>node-cron runs at 02:00 server time; a DB advisory lock stops two instances running at once.</w:t>
+        <w:t>A daily scheduled job (Vercel Cron in production, calling a secret-protected API route; node-cron at 02:00 locally) starts the run; a DB advisory lock stops two runs at once (Amendment 1). On the Hobby plan the cron fires once a day, possibly up to an hour late, which suits a daily job.</w:t>
       </w:r>
     </w:p>
     <w:p>
@@ -4823,8 +4822,6 @@
           <w:p>
             <w:r>
               <w:t xml:space="preserve">32-byte random, stored hashed, expiry and </w:t>
-            </w:r>
-            <w:r>
               <w:lastRenderedPageBreak/>
               <w:t>revocation checked on every view</w:t>
             </w:r>
@@ -5142,7 +5139,7 @@
     </w:p>
     <w:p>
       <w:r>
-        <w:t>The prototype runs on three free-tier services (static host, API host, managed PostgreSQL) plus object storage; the AI API is called only when F17 is enabled.</w:t>
+        <w:t>The prototype runs on two free-tier services (Amendment 1): Vercel, which serves the SPA and runs the API as a serverless function on the same origin, and Neon for managed PostgreSQL. Object storage is added in Sprint 6, and the AI API is called only when F17 is enabled. Migrations run in the Vercel production build before new code goes live.</w:t>
       </w:r>
     </w:p>
     <w:p>
@@ -5459,7 +5456,7 @@
         <w:t>AI_MONTHLY_CAP</w:t>
       </w:r>
       <w:r>
-        <w:t>. Hosting names are examples; any equivalent free tier works.</w:t>
+        <w:t>, plus DIRECT_DATABASE_URL (migrations), TRUST_PROXY_HOPS and RATE_LIMIT_STORE for serverless hosting (Amendment 1).</w:t>
       </w:r>
     </w:p>
     <w:p>
@@ -5533,8 +5530,6 @@
           <w:p>
             <w:r>
               <w:t xml:space="preserve">NFR-03 Performance (2 s, 100 </w:t>
-            </w:r>
-            <w:r>
               <w:lastRenderedPageBreak/>
               <w:t>users)</w:t>
             </w:r>
@@ -5548,8 +5543,6 @@
             <w:r>
               <w:lastRenderedPageBreak/>
               <w:t xml:space="preserve">Indexes on all FKs and filter </w:t>
-            </w:r>
-            <w:r>
               <w:lastRenderedPageBreak/>
               <w:t>columns; aggregates in SQL; TanStack Query caching; pagination</w:t>
             </w:r>
@@ -5923,8 +5916,6 @@
           <w:p>
             <w:r>
               <w:t xml:space="preserve">Changes to attendance, marks, enrollment, completion, </w:t>
-            </w:r>
-            <w:r>
               <w:lastRenderedPageBreak/>
               <w:t>certificates, passport entries, settings: user, action, entity, id, old value, new value, timestamp</w:t>
             </w:r>
@@ -6567,7 +6558,7 @@
           </w:tcPr>
           <w:p>
             <w:r>
-              <w:t>Free-tier API host sleeps when idle; first request slow and cron may not fire</w:t>
+              <w:t>Serverless cold start and once-a-day cron (Amendment 1)</w:t>
             </w:r>
           </w:p>
         </w:tc>
@@ -6587,7 +6578,39 @@
           </w:tcPr>
           <w:p>
             <w:r>
-              <w:t>Uptime pinger keeps it awake; on-demand evaluation after attendance save; run a catch-up job at startup</w:t>
+              <w:t>Function in sin1 next to Neon; on-demand evaluation after attendance save; the job catches up from its last successful run date</w:t>
+            </w:r>
+          </w:p>
+        </w:tc>
+      </w:tr>
+      <w:tr>
+        <w:tc>
+          <w:tcPr>
+            <w:tcW w:w="3120" w:type="dxa"/>
+          </w:tcPr>
+          <w:p>
+            <w:r>
+              <w:t>No shared memory across serverless instances (Amendment 1)</w:t>
+            </w:r>
+          </w:p>
+        </w:tc>
+        <w:tc>
+          <w:tcPr>
+            <w:tcW w:w="3120" w:type="dxa"/>
+          </w:tcPr>
+          <w:p>
+            <w:r>
+              <w:t>Per-instance rate limits are bypassable</w:t>
+            </w:r>
+          </w:p>
+        </w:tc>
+        <w:tc>
+          <w:tcPr>
+            <w:tcW w:w="3120" w:type="dxa"/>
+          </w:tcPr>
+          <w:p>
+            <w:r>
+              <w:t>Security rate limits counted in a Postgres table (rate_limits)</w:t>
             </w:r>
           </w:p>
         </w:tc>
@@ -6619,7 +6642,7 @@
           </w:tcPr>
           <w:p>
             <w:r>
-              <w:t>Prisma connection pool size 5; pooled connection string (PgBouncer)</w:t>
+              <w:t>Neon pooled connection string (PgBouncer), connection_limit=1 per function instance (Amendment 1)</w:t>
             </w:r>
           </w:p>
         </w:tc>

</xml_diff>

<commit_message>
Name the Vercel Blob store in the TAD
Word TAD and TAD.md: Amendment 1, file storage row, section 11 and the environment variable list now record the private Vercel Blob store chosen in Sprint 6.

Co-Authored-By: Claude Opus 5.5 <noreply@anthropic.com>
</commit_message>
<xml_diff>
--- a/docs/KISS_VTMP_TAD_v1.0.docx
+++ b/docs/KISS_VTMP_TAD_v1.0.docx
@@ -184,7 +184,7 @@
     </w:p>
     <w:p>
       <w:r>
-        <w:t>Amendment 1 (2026-10-19): hosting is Vercel + Neon only. The API no longer runs on Render/Railway: Render requires a card, and the team’s card was declined. One Vercel project (Hobby, function region sin1) serves the React SPA and runs the unchanged Express app as a serverless function on the same origin. PostgreSQL 16 is on Neon (Singapore). Locally and in CI the API still runs as a normal server. Effects: scheduling (ADR-07, §8.2) uses Vercel Cron in production with node-cron only locally; security rate limits share counts in a Postgres table because serverless instances share no memory; files go to an object store because functions have no persistent disk; the free-tier risks in §15.1 change accordingly. Rows changed by this amendment are marked “(Amendment 1)”. Setup and reasons: docs/DEPLOYMENT.md and docs/PROGRESS.md (Sprint 2).</w:t>
+        <w:t>Amendment 1 (2026-10-19): hosting is Vercel + Neon only. The API no longer runs on Render/Railway: Render requires a card, and the team’s card was declined. One Vercel project (Hobby, function region sin1) serves the React SPA and runs the unchanged Express app as a serverless function on the same origin. PostgreSQL 16 is on Neon (Singapore). Locally and in CI the API still runs as a normal server. Effects: scheduling (ADR-07, §8.2) uses Vercel Cron in production with node-cron only locally; security rate limits share counts in a Postgres table because serverless instances share no memory; files go to a private Vercel Blob store (chosen in Sprint 6) because functions have no persistent disk; the free-tier risks in §15.1 change accordingly. Rows changed by this amendment are marked “(Amendment 1)”. Setup and reasons: docs/DEPLOYMENT.md and docs/PROGRESS.md (Sprint 2).</w:t>
       </w:r>
     </w:p>
     <w:p>
@@ -1237,7 +1237,7 @@
           </w:tcPr>
           <w:p>
             <w:r>
-              <w:t>Private object store reachable from Vercel without a card (Vercel Blob or Neon object storage; chosen in Sprint 6) (Amendment 1)</w:t>
+              <w:t>Private Vercel Blob store attached to the Vercel project, chosen in Sprint 6; local disk in development (Amendment 1)</w:t>
             </w:r>
           </w:p>
         </w:tc>
@@ -5139,7 +5139,7 @@
     </w:p>
     <w:p>
       <w:r>
-        <w:t>The prototype runs on two free-tier services (Amendment 1): Vercel, which serves the SPA and runs the API as a serverless function on the same origin, and Neon for managed PostgreSQL. Object storage is added in Sprint 6, and the AI API is called only when F17 is enabled. Migrations run in the Vercel production build before new code goes live.</w:t>
+        <w:t>The prototype runs on two free-tier services (Amendment 1): Vercel, which serves the SPA and runs the API as a serverless function on the same origin, and Neon for managed PostgreSQL. Files (certificate PDFs, later evidence) live in a private Vercel Blob store attached to the same project (Sprint 6); the database keeps only each file’s key. The AI API is called only when F17 is enabled. Migrations run in the Vercel production build before new code goes live.</w:t>
       </w:r>
     </w:p>
     <w:p>
@@ -5456,7 +5456,7 @@
         <w:t>AI_MONTHLY_CAP</w:t>
       </w:r>
       <w:r>
-        <w:t>, plus DIRECT_DATABASE_URL (migrations), TRUST_PROXY_HOPS and RATE_LIMIT_STORE for serverless hosting (Amendment 1).</w:t>
+        <w:t>, plus DIRECT_DATABASE_URL (migrations), TRUST_PROXY_HOPS and RATE_LIMIT_STORE for serverless hosting, and BLOB_READ_WRITE_TOKEN with STORAGE_DRIVER=vercel-blob for file storage (Amendment 1).</w:t>
       </w:r>
     </w:p>
     <w:p>

</xml_diff>